<commit_message>
Finalize submission with recorded video link, screenshots and Git evidence
</commit_message>
<xml_diff>
--- a/submission/Technical_Report.docx
+++ b/submission/Technical_Report.docx
@@ -282,12 +282,45 @@
       </w:pPr>
       <w:r>
         <w:rPr>
-          <w:rFonts w:hint="eastAsia" w:ascii="Arial Regular" w:hAnsi="Arial Regular" w:eastAsia="宋体" w:cs="Arial Regular"/>
-          <w:sz w:val="28"/>
-          <w:szCs w:val="28"/>
-          <w:lang w:bidi="ar"/>
+          <w:rFonts w:ascii="Arial" w:hAnsi="Arial"/>
+          <w:sz w:val="22"/>
         </w:rPr>
-        <w:t>Demo Video URL: To be added after recording</w:t>
+        <w:t xml:space="preserve">Demo Video URL: </w:t>
+      </w:r>
+      <w:r>
+        <w:rPr>
+          <w:rFonts w:ascii="Arial" w:hAnsi="Arial"/>
+          <w:sz w:val="22"/>
+        </w:rPr>
+        <w:fldChar w:fldCharType="begin"/>
+      </w:r>
+      <w:r>
+        <w:rPr>
+          <w:rFonts w:ascii="Arial" w:hAnsi="Arial"/>
+          <w:sz w:val="22"/>
+        </w:rPr>
+        <w:instrText xml:space="preserve"> HYPERLINK "https://www.bilibili.com/video/BV1xgnp64E3X/" \h </w:instrText>
+      </w:r>
+      <w:r>
+        <w:rPr>
+          <w:rFonts w:ascii="Arial" w:hAnsi="Arial"/>
+          <w:sz w:val="22"/>
+        </w:rPr>
+        <w:fldChar w:fldCharType="separate"/>
+      </w:r>
+      <w:r>
+        <w:rPr>
+          <w:rFonts w:ascii="Arial" w:hAnsi="Arial"/>
+          <w:sz w:val="22"/>
+        </w:rPr>
+        <w:t>https://www.bilibili.com/video/BV1xgnp64E3X/</w:t>
+      </w:r>
+      <w:r>
+        <w:rPr>
+          <w:rFonts w:ascii="Arial" w:hAnsi="Arial"/>
+          <w:sz w:val="22"/>
+        </w:rPr>
+        <w:fldChar w:fldCharType="end"/>
       </w:r>
     </w:p>
     <w:p>
@@ -312,7 +345,7 @@
         <w:rPr>
           <w:rFonts w:hint="eastAsia" w:eastAsia="宋体"/>
         </w:rPr>
-        <w:t>10 / 19 / 2026</w:t>
+        <w:t>10 / 22 / 2026</w:t>
       </w:r>
     </w:p>
     <w:p>
@@ -357,7 +390,7 @@
         <w:fldChar w:fldCharType="begin"/>
       </w:r>
       <w:r>
-        <w:instrText xml:space="preserve"> HYPERLINK \l _Toc7560 </w:instrText>
+        <w:instrText xml:space="preserve"> HYPERLINK \l _Toc26895 </w:instrText>
       </w:r>
       <w:r>
         <w:fldChar w:fldCharType="separate"/>
@@ -372,7 +405,7 @@
         <w:fldChar w:fldCharType="begin"/>
       </w:r>
       <w:r>
-        <w:instrText xml:space="preserve"> PAGEREF _Toc7560 \h </w:instrText>
+        <w:instrText xml:space="preserve"> PAGEREF _Toc26895 \h </w:instrText>
       </w:r>
       <w:r>
         <w:fldChar w:fldCharType="separate"/>
@@ -398,7 +431,7 @@
         <w:fldChar w:fldCharType="begin"/>
       </w:r>
       <w:r>
-        <w:instrText xml:space="preserve"> HYPERLINK \l _Toc3239 </w:instrText>
+        <w:instrText xml:space="preserve"> HYPERLINK \l _Toc22484 </w:instrText>
       </w:r>
       <w:r>
         <w:fldChar w:fldCharType="separate"/>
@@ -413,7 +446,7 @@
         <w:fldChar w:fldCharType="begin"/>
       </w:r>
       <w:r>
-        <w:instrText xml:space="preserve"> PAGEREF _Toc3239 \h </w:instrText>
+        <w:instrText xml:space="preserve"> PAGEREF _Toc22484 \h </w:instrText>
       </w:r>
       <w:r>
         <w:fldChar w:fldCharType="separate"/>
@@ -439,7 +472,7 @@
         <w:fldChar w:fldCharType="begin"/>
       </w:r>
       <w:r>
-        <w:instrText xml:space="preserve"> HYPERLINK \l _Toc32010 </w:instrText>
+        <w:instrText xml:space="preserve"> HYPERLINK \l _Toc5401 </w:instrText>
       </w:r>
       <w:r>
         <w:fldChar w:fldCharType="separate"/>
@@ -454,7 +487,7 @@
         <w:fldChar w:fldCharType="begin"/>
       </w:r>
       <w:r>
-        <w:instrText xml:space="preserve"> PAGEREF _Toc32010 \h </w:instrText>
+        <w:instrText xml:space="preserve"> PAGEREF _Toc5401 \h </w:instrText>
       </w:r>
       <w:r>
         <w:fldChar w:fldCharType="separate"/>
@@ -480,7 +513,7 @@
         <w:fldChar w:fldCharType="begin"/>
       </w:r>
       <w:r>
-        <w:instrText xml:space="preserve"> HYPERLINK \l _Toc19983 </w:instrText>
+        <w:instrText xml:space="preserve"> HYPERLINK \l _Toc4222 </w:instrText>
       </w:r>
       <w:r>
         <w:fldChar w:fldCharType="separate"/>
@@ -495,7 +528,7 @@
         <w:fldChar w:fldCharType="begin"/>
       </w:r>
       <w:r>
-        <w:instrText xml:space="preserve"> PAGEREF _Toc19983 \h </w:instrText>
+        <w:instrText xml:space="preserve"> PAGEREF _Toc4222 \h </w:instrText>
       </w:r>
       <w:r>
         <w:fldChar w:fldCharType="separate"/>
@@ -521,7 +554,7 @@
         <w:fldChar w:fldCharType="begin"/>
       </w:r>
       <w:r>
-        <w:instrText xml:space="preserve"> HYPERLINK \l _Toc8737 </w:instrText>
+        <w:instrText xml:space="preserve"> HYPERLINK \l _Toc21725 </w:instrText>
       </w:r>
       <w:r>
         <w:fldChar w:fldCharType="separate"/>
@@ -536,7 +569,7 @@
         <w:fldChar w:fldCharType="begin"/>
       </w:r>
       <w:r>
-        <w:instrText xml:space="preserve"> PAGEREF _Toc8737 \h </w:instrText>
+        <w:instrText xml:space="preserve"> PAGEREF _Toc21725 \h </w:instrText>
       </w:r>
       <w:r>
         <w:fldChar w:fldCharType="separate"/>
@@ -562,7 +595,7 @@
         <w:fldChar w:fldCharType="begin"/>
       </w:r>
       <w:r>
-        <w:instrText xml:space="preserve"> HYPERLINK \l _Toc1912 </w:instrText>
+        <w:instrText xml:space="preserve"> HYPERLINK \l _Toc13193 </w:instrText>
       </w:r>
       <w:r>
         <w:fldChar w:fldCharType="separate"/>
@@ -577,7 +610,7 @@
         <w:fldChar w:fldCharType="begin"/>
       </w:r>
       <w:r>
-        <w:instrText xml:space="preserve"> PAGEREF _Toc1912 \h </w:instrText>
+        <w:instrText xml:space="preserve"> PAGEREF _Toc13193 \h </w:instrText>
       </w:r>
       <w:r>
         <w:fldChar w:fldCharType="separate"/>
@@ -603,7 +636,7 @@
         <w:fldChar w:fldCharType="begin"/>
       </w:r>
       <w:r>
-        <w:instrText xml:space="preserve"> HYPERLINK \l _Toc19964 </w:instrText>
+        <w:instrText xml:space="preserve"> HYPERLINK \l _Toc26077 </w:instrText>
       </w:r>
       <w:r>
         <w:fldChar w:fldCharType="separate"/>
@@ -618,7 +651,7 @@
         <w:fldChar w:fldCharType="begin"/>
       </w:r>
       <w:r>
-        <w:instrText xml:space="preserve"> PAGEREF _Toc19964 \h </w:instrText>
+        <w:instrText xml:space="preserve"> PAGEREF _Toc26077 \h </w:instrText>
       </w:r>
       <w:r>
         <w:fldChar w:fldCharType="separate"/>
@@ -644,7 +677,7 @@
         <w:fldChar w:fldCharType="begin"/>
       </w:r>
       <w:r>
-        <w:instrText xml:space="preserve"> HYPERLINK \l _Toc1350 </w:instrText>
+        <w:instrText xml:space="preserve"> HYPERLINK \l _Toc11982 </w:instrText>
       </w:r>
       <w:r>
         <w:fldChar w:fldCharType="separate"/>
@@ -659,7 +692,7 @@
         <w:fldChar w:fldCharType="begin"/>
       </w:r>
       <w:r>
-        <w:instrText xml:space="preserve"> PAGEREF _Toc1350 \h </w:instrText>
+        <w:instrText xml:space="preserve"> PAGEREF _Toc11982 \h </w:instrText>
       </w:r>
       <w:r>
         <w:fldChar w:fldCharType="separate"/>
@@ -685,7 +718,7 @@
         <w:fldChar w:fldCharType="begin"/>
       </w:r>
       <w:r>
-        <w:instrText xml:space="preserve"> HYPERLINK \l _Toc13209 </w:instrText>
+        <w:instrText xml:space="preserve"> HYPERLINK \l _Toc4960 </w:instrText>
       </w:r>
       <w:r>
         <w:fldChar w:fldCharType="separate"/>
@@ -700,7 +733,7 @@
         <w:fldChar w:fldCharType="begin"/>
       </w:r>
       <w:r>
-        <w:instrText xml:space="preserve"> PAGEREF _Toc13209 \h </w:instrText>
+        <w:instrText xml:space="preserve"> PAGEREF _Toc4960 \h </w:instrText>
       </w:r>
       <w:r>
         <w:fldChar w:fldCharType="separate"/>
@@ -726,7 +759,7 @@
         <w:fldChar w:fldCharType="begin"/>
       </w:r>
       <w:r>
-        <w:instrText xml:space="preserve"> HYPERLINK \l _Toc3584 </w:instrText>
+        <w:instrText xml:space="preserve"> HYPERLINK \l _Toc18922 </w:instrText>
       </w:r>
       <w:r>
         <w:fldChar w:fldCharType="separate"/>
@@ -741,7 +774,7 @@
         <w:fldChar w:fldCharType="begin"/>
       </w:r>
       <w:r>
-        <w:instrText xml:space="preserve"> PAGEREF _Toc3584 \h </w:instrText>
+        <w:instrText xml:space="preserve"> PAGEREF _Toc18922 \h </w:instrText>
       </w:r>
       <w:r>
         <w:fldChar w:fldCharType="separate"/>
@@ -767,7 +800,7 @@
         <w:fldChar w:fldCharType="begin"/>
       </w:r>
       <w:r>
-        <w:instrText xml:space="preserve"> HYPERLINK \l _Toc26841 </w:instrText>
+        <w:instrText xml:space="preserve"> HYPERLINK \l _Toc21055 </w:instrText>
       </w:r>
       <w:r>
         <w:fldChar w:fldCharType="separate"/>
@@ -782,7 +815,7 @@
         <w:fldChar w:fldCharType="begin"/>
       </w:r>
       <w:r>
-        <w:instrText xml:space="preserve"> PAGEREF _Toc26841 \h </w:instrText>
+        <w:instrText xml:space="preserve"> PAGEREF _Toc21055 \h </w:instrText>
       </w:r>
       <w:r>
         <w:fldChar w:fldCharType="separate"/>
@@ -808,7 +841,7 @@
         <w:fldChar w:fldCharType="begin"/>
       </w:r>
       <w:r>
-        <w:instrText xml:space="preserve"> HYPERLINK \l _Toc2963 </w:instrText>
+        <w:instrText xml:space="preserve"> HYPERLINK \l _Toc27474 </w:instrText>
       </w:r>
       <w:r>
         <w:fldChar w:fldCharType="separate"/>
@@ -823,7 +856,7 @@
         <w:fldChar w:fldCharType="begin"/>
       </w:r>
       <w:r>
-        <w:instrText xml:space="preserve"> PAGEREF _Toc2963 \h </w:instrText>
+        <w:instrText xml:space="preserve"> PAGEREF _Toc27474 \h </w:instrText>
       </w:r>
       <w:r>
         <w:fldChar w:fldCharType="separate"/>
@@ -849,7 +882,7 @@
         <w:fldChar w:fldCharType="begin"/>
       </w:r>
       <w:r>
-        <w:instrText xml:space="preserve"> HYPERLINK \l _Toc30017 </w:instrText>
+        <w:instrText xml:space="preserve"> HYPERLINK \l _Toc10259 </w:instrText>
       </w:r>
       <w:r>
         <w:fldChar w:fldCharType="separate"/>
@@ -864,7 +897,7 @@
         <w:fldChar w:fldCharType="begin"/>
       </w:r>
       <w:r>
-        <w:instrText xml:space="preserve"> PAGEREF _Toc30017 \h </w:instrText>
+        <w:instrText xml:space="preserve"> PAGEREF _Toc10259 \h </w:instrText>
       </w:r>
       <w:r>
         <w:fldChar w:fldCharType="separate"/>
@@ -890,7 +923,7 @@
         <w:fldChar w:fldCharType="begin"/>
       </w:r>
       <w:r>
-        <w:instrText xml:space="preserve"> HYPERLINK \l _Toc16279 </w:instrText>
+        <w:instrText xml:space="preserve"> HYPERLINK \l _Toc16208 </w:instrText>
       </w:r>
       <w:r>
         <w:fldChar w:fldCharType="separate"/>
@@ -905,7 +938,7 @@
         <w:fldChar w:fldCharType="begin"/>
       </w:r>
       <w:r>
-        <w:instrText xml:space="preserve"> PAGEREF _Toc16279 \h </w:instrText>
+        <w:instrText xml:space="preserve"> PAGEREF _Toc16208 \h </w:instrText>
       </w:r>
       <w:r>
         <w:fldChar w:fldCharType="separate"/>
@@ -931,7 +964,7 @@
         <w:fldChar w:fldCharType="begin"/>
       </w:r>
       <w:r>
-        <w:instrText xml:space="preserve"> HYPERLINK \l _Toc5029 </w:instrText>
+        <w:instrText xml:space="preserve"> HYPERLINK \l _Toc8393 </w:instrText>
       </w:r>
       <w:r>
         <w:fldChar w:fldCharType="separate"/>
@@ -946,7 +979,7 @@
         <w:fldChar w:fldCharType="begin"/>
       </w:r>
       <w:r>
-        <w:instrText xml:space="preserve"> PAGEREF _Toc5029 \h </w:instrText>
+        <w:instrText xml:space="preserve"> PAGEREF _Toc8393 \h </w:instrText>
       </w:r>
       <w:r>
         <w:fldChar w:fldCharType="separate"/>
@@ -972,7 +1005,7 @@
         <w:fldChar w:fldCharType="begin"/>
       </w:r>
       <w:r>
-        <w:instrText xml:space="preserve"> HYPERLINK \l _Toc25279 </w:instrText>
+        <w:instrText xml:space="preserve"> HYPERLINK \l _Toc6079 </w:instrText>
       </w:r>
       <w:r>
         <w:fldChar w:fldCharType="separate"/>
@@ -987,7 +1020,7 @@
         <w:fldChar w:fldCharType="begin"/>
       </w:r>
       <w:r>
-        <w:instrText xml:space="preserve"> PAGEREF _Toc25279 \h </w:instrText>
+        <w:instrText xml:space="preserve"> PAGEREF _Toc6079 \h </w:instrText>
       </w:r>
       <w:r>
         <w:fldChar w:fldCharType="separate"/>
@@ -1013,7 +1046,7 @@
         <w:fldChar w:fldCharType="begin"/>
       </w:r>
       <w:r>
-        <w:instrText xml:space="preserve"> HYPERLINK \l _Toc9810 </w:instrText>
+        <w:instrText xml:space="preserve"> HYPERLINK \l _Toc28138 </w:instrText>
       </w:r>
       <w:r>
         <w:fldChar w:fldCharType="separate"/>
@@ -1028,7 +1061,7 @@
         <w:fldChar w:fldCharType="begin"/>
       </w:r>
       <w:r>
-        <w:instrText xml:space="preserve"> PAGEREF _Toc9810 \h </w:instrText>
+        <w:instrText xml:space="preserve"> PAGEREF _Toc28138 \h </w:instrText>
       </w:r>
       <w:r>
         <w:fldChar w:fldCharType="separate"/>
@@ -1054,7 +1087,7 @@
         <w:fldChar w:fldCharType="begin"/>
       </w:r>
       <w:r>
-        <w:instrText xml:space="preserve"> HYPERLINK \l _Toc20708 </w:instrText>
+        <w:instrText xml:space="preserve"> HYPERLINK \l _Toc21173 </w:instrText>
       </w:r>
       <w:r>
         <w:fldChar w:fldCharType="separate"/>
@@ -1069,7 +1102,7 @@
         <w:fldChar w:fldCharType="begin"/>
       </w:r>
       <w:r>
-        <w:instrText xml:space="preserve"> PAGEREF _Toc20708 \h </w:instrText>
+        <w:instrText xml:space="preserve"> PAGEREF _Toc21173 \h </w:instrText>
       </w:r>
       <w:r>
         <w:fldChar w:fldCharType="separate"/>
@@ -1095,7 +1128,7 @@
         <w:fldChar w:fldCharType="begin"/>
       </w:r>
       <w:r>
-        <w:instrText xml:space="preserve"> HYPERLINK \l _Toc6521 </w:instrText>
+        <w:instrText xml:space="preserve"> HYPERLINK \l _Toc25883 </w:instrText>
       </w:r>
       <w:r>
         <w:fldChar w:fldCharType="separate"/>
@@ -1110,13 +1143,13 @@
         <w:fldChar w:fldCharType="begin"/>
       </w:r>
       <w:r>
-        <w:instrText xml:space="preserve"> PAGEREF _Toc6521 \h </w:instrText>
+        <w:instrText xml:space="preserve"> PAGEREF _Toc25883 \h </w:instrText>
       </w:r>
       <w:r>
         <w:fldChar w:fldCharType="separate"/>
       </w:r>
       <w:r>
-        <w:t>21</w:t>
+        <w:t>24</w:t>
       </w:r>
       <w:r>
         <w:fldChar w:fldCharType="end"/>
@@ -1136,13 +1169,13 @@
         <w:fldChar w:fldCharType="begin"/>
       </w:r>
       <w:r>
-        <w:instrText xml:space="preserve"> HYPERLINK \l _Toc11849 </w:instrText>
+        <w:instrText xml:space="preserve"> HYPERLINK \l _Toc18310 </w:instrText>
       </w:r>
       <w:r>
         <w:fldChar w:fldCharType="separate"/>
       </w:r>
       <w:r>
-        <w:t>20 Git evidence and submission completion</w:t>
+        <w:t>20 Git repository and command evidence</w:t>
       </w:r>
       <w:r>
         <w:tab/>
@@ -1151,13 +1184,13 @@
         <w:fldChar w:fldCharType="begin"/>
       </w:r>
       <w:r>
-        <w:instrText xml:space="preserve"> PAGEREF _Toc11849 \h </w:instrText>
+        <w:instrText xml:space="preserve"> PAGEREF _Toc18310 \h </w:instrText>
       </w:r>
       <w:r>
         <w:fldChar w:fldCharType="separate"/>
       </w:r>
       <w:r>
-        <w:t>22</w:t>
+        <w:t>26</w:t>
       </w:r>
       <w:r>
         <w:fldChar w:fldCharType="end"/>
@@ -1177,7 +1210,7 @@
         <w:fldChar w:fldCharType="begin"/>
       </w:r>
       <w:r>
-        <w:instrText xml:space="preserve"> HYPERLINK \l _Toc3551 </w:instrText>
+        <w:instrText xml:space="preserve"> HYPERLINK \l _Toc32671 </w:instrText>
       </w:r>
       <w:r>
         <w:fldChar w:fldCharType="separate"/>
@@ -1192,13 +1225,13 @@
         <w:fldChar w:fldCharType="begin"/>
       </w:r>
       <w:r>
-        <w:instrText xml:space="preserve"> PAGEREF _Toc3551 \h </w:instrText>
+        <w:instrText xml:space="preserve"> PAGEREF _Toc32671 \h </w:instrText>
       </w:r>
       <w:r>
         <w:fldChar w:fldCharType="separate"/>
       </w:r>
       <w:r>
-        <w:t>23</w:t>
+        <w:t>30</w:t>
       </w:r>
       <w:r>
         <w:fldChar w:fldCharType="end"/>
@@ -1220,7 +1253,7 @@
         <w:pStyle w:val="2"/>
         <w:pageBreakBefore/>
       </w:pPr>
-      <w:bookmarkStart w:id="0" w:name="_Toc7560"/>
+      <w:bookmarkStart w:id="0" w:name="_Toc26895"/>
       <w:r>
         <w:t>1 Introduction and scope</w:t>
       </w:r>
@@ -1255,7 +1288,7 @@
         <w:pStyle w:val="38"/>
       </w:pPr>
       <w:r>
-        <w:t>The repository URL is https://github.com/denniswang12345/ProjectPos_2026. A presentation video has not yet been recorded or uploaded. Its final bilibili URL must be added to the cover before submission. The report describes verified local behavior and distinguishes the proposed sprint plan from historical project evidence.</w:t>
+        <w:t>The repository is https://github.com/denniswang12345/ProjectPos_2026. Both main and the personal development branch have been pushed. The personal branch changes are merged into main, which is the default branch. The presentation has been recorded and uploaded to bilibili; the playback URL appears on the cover and in Chapter 20. The sprint plan remains a proposed plan rather than a historical record of elapsed sprint days.</w:t>
       </w:r>
     </w:p>
     <w:tbl>
@@ -1648,17 +1681,12 @@
             <w:vAlign w:val="center"/>
           </w:tcPr>
           <w:p>
-            <w:pPr>
-              <w:spacing w:after="40" w:line="240" w:lineRule="auto"/>
-              <w:jc w:val="left"/>
-            </w:pPr>
-            <w:r>
-              <w:rPr>
-                <w:rFonts w:ascii="Arial" w:hAnsi="Arial"/>
-                <w:b w:val="0"/>
-                <w:sz w:val="18"/>
-              </w:rPr>
-              <w:t>PowerPoint and separate recording script</w:t>
+            <w:r>
+              <w:rPr>
+                <w:rFonts w:ascii="Arial" w:hAnsi="Arial"/>
+                <w:sz w:val="18"/>
+              </w:rPr>
+              <w:t>PowerPoint and live console demonstration</w:t>
             </w:r>
           </w:p>
         </w:tc>
@@ -1746,7 +1774,7 @@
         <w:pStyle w:val="2"/>
         <w:pageBreakBefore/>
       </w:pPr>
-      <w:bookmarkStart w:id="1" w:name="_Toc3239"/>
+      <w:bookmarkStart w:id="1" w:name="_Toc22484"/>
       <w:r>
         <w:t>2 Business rules and project assumptions</w:t>
       </w:r>
@@ -1821,7 +1849,7 @@
         <w:pStyle w:val="2"/>
         <w:pageBreakBefore/>
       </w:pPr>
-      <w:bookmarkStart w:id="2" w:name="_Toc32010"/>
+      <w:bookmarkStart w:id="2" w:name="_Toc5401"/>
       <w:r>
         <w:t>3 Product backlog and prioritization</w:t>
       </w:r>
@@ -3424,7 +3452,7 @@
         <w:pStyle w:val="2"/>
         <w:pageBreakBefore/>
       </w:pPr>
-      <w:bookmarkStart w:id="3" w:name="_Toc19983"/>
+      <w:bookmarkStart w:id="3" w:name="_Toc4222"/>
       <w:r>
         <w:t>4 Proposed sprint plan and working agreements</w:t>
       </w:r>
@@ -3483,7 +3511,7 @@
         <w:pStyle w:val="2"/>
         <w:pageBreakBefore/>
       </w:pPr>
-      <w:bookmarkStart w:id="4" w:name="_Toc8737"/>
+      <w:bookmarkStart w:id="4" w:name="_Toc21725"/>
       <w:r>
         <w:t>5 Burndown plan and progress recording</w:t>
       </w:r>
@@ -4459,7 +4487,7 @@
         <w:pStyle w:val="2"/>
         <w:pageBreakBefore/>
       </w:pPr>
-      <w:bookmarkStart w:id="5" w:name="_Toc1912"/>
+      <w:bookmarkStart w:id="5" w:name="_Toc13193"/>
       <w:r>
         <w:t>6 Use case overview</w:t>
       </w:r>
@@ -4543,7 +4571,7 @@
         <w:pStyle w:val="2"/>
         <w:pageBreakBefore/>
       </w:pPr>
-      <w:bookmarkStart w:id="6" w:name="_Toc19964"/>
+      <w:bookmarkStart w:id="6" w:name="_Toc26077"/>
       <w:r>
         <w:t>7 Process Sale fully dressed use case</w:t>
       </w:r>
@@ -4656,7 +4684,7 @@
         <w:pStyle w:val="2"/>
         <w:pageBreakBefore/>
       </w:pPr>
-      <w:bookmarkStart w:id="7" w:name="_Toc1350"/>
+      <w:bookmarkStart w:id="7" w:name="_Toc11982"/>
       <w:r>
         <w:t>8 Process Sale extensions and operation contracts</w:t>
       </w:r>
@@ -4733,7 +4761,7 @@
         <w:pStyle w:val="2"/>
         <w:pageBreakBefore/>
       </w:pPr>
-      <w:bookmarkStart w:id="8" w:name="_Toc13209"/>
+      <w:bookmarkStart w:id="8" w:name="_Toc4960"/>
       <w:r>
         <w:t>9 Handle Returns fully dressed use case</w:t>
       </w:r>
@@ -4846,7 +4874,7 @@
         <w:pStyle w:val="2"/>
         <w:pageBreakBefore/>
       </w:pPr>
-      <w:bookmarkStart w:id="9" w:name="_Toc3584"/>
+      <w:bookmarkStart w:id="9" w:name="_Toc18922"/>
       <w:r>
         <w:t>10 Handle Returns extensions and operation contracts</w:t>
       </w:r>
@@ -4937,7 +4965,7 @@
         <w:pStyle w:val="2"/>
         <w:pageBreakBefore/>
       </w:pPr>
-      <w:bookmarkStart w:id="10" w:name="_Toc26841"/>
+      <w:bookmarkStart w:id="10" w:name="_Toc21055"/>
       <w:r>
         <w:t>11 System sequence diagrams</w:t>
       </w:r>
@@ -5013,7 +5041,7 @@
         <w:pStyle w:val="2"/>
         <w:pageBreakBefore/>
       </w:pPr>
-      <w:bookmarkStart w:id="11" w:name="_Toc2963"/>
+      <w:bookmarkStart w:id="11" w:name="_Toc27474"/>
       <w:r>
         <w:t>12 Domain model</w:t>
       </w:r>
@@ -5105,7 +5133,7 @@
         <w:pStyle w:val="2"/>
         <w:pageBreakBefore/>
       </w:pPr>
-      <w:bookmarkStart w:id="12" w:name="_Toc30017"/>
+      <w:bookmarkStart w:id="12" w:name="_Toc10259"/>
       <w:r>
         <w:t>13 Logical architecture and package dependencies</w:t>
       </w:r>
@@ -5197,7 +5225,7 @@
         <w:pStyle w:val="2"/>
         <w:pageBreakBefore/>
       </w:pPr>
-      <w:bookmarkStart w:id="13" w:name="_Toc16279"/>
+      <w:bookmarkStart w:id="13" w:name="_Toc16208"/>
       <w:r>
         <w:t>14 Object design for Process Sale</w:t>
       </w:r>
@@ -5289,7 +5317,7 @@
         <w:pStyle w:val="2"/>
         <w:pageBreakBefore/>
       </w:pPr>
-      <w:bookmarkStart w:id="14" w:name="_Toc5029"/>
+      <w:bookmarkStart w:id="14" w:name="_Toc8393"/>
       <w:r>
         <w:t>15 Object design for Handle Returns</w:t>
       </w:r>
@@ -5389,7 +5417,7 @@
         <w:pStyle w:val="2"/>
         <w:pageBreakBefore/>
       </w:pPr>
-      <w:bookmarkStart w:id="15" w:name="_Toc25279"/>
+      <w:bookmarkStart w:id="15" w:name="_Toc6079"/>
       <w:r>
         <w:t>16 Design class model and responsibility mapping</w:t>
       </w:r>
@@ -5481,7 +5509,7 @@
         <w:pStyle w:val="2"/>
         <w:pageBreakBefore/>
       </w:pPr>
-      <w:bookmarkStart w:id="16" w:name="_Toc9810"/>
+      <w:bookmarkStart w:id="16" w:name="_Toc28138"/>
       <w:r>
         <w:t>17 Implementation and running the application</w:t>
       </w:r>
@@ -5532,7 +5560,7 @@
         <w:pStyle w:val="2"/>
         <w:pageBreakBefore/>
       </w:pPr>
-      <w:bookmarkStart w:id="17" w:name="_Toc20708"/>
+      <w:bookmarkStart w:id="17" w:name="_Toc21173"/>
       <w:r>
         <w:t>18 Demonstration evidence</w:t>
       </w:r>
@@ -5543,33 +5571,26 @@
         <w:pStyle w:val="38"/>
       </w:pPr>
       <w:r>
-        <w:t>The accompanying image reproduces text captured from an actual local execution of python pos.py --demo. It is an execution transcript image rather than a screenshot of a graphical POS terminal. Generated transaction identifiers vary on every run.</w:t>
-      </w:r>
-    </w:p>
-    <w:p>
-      <w:pPr>
-        <w:pStyle w:val="38"/>
-      </w:pPr>
-      <w:r>
-        <w:t>The sale contains MILK quantity 2 at CNY 6.50 and BREAD quantity 1 at CNY 8.00. Total is CNY 21.00, cash tendered is CNY 30.00 and change is CNY 9.00. Milk stock decreases from 20 to 18 and bread stock from 15 to 14.</w:t>
-      </w:r>
-    </w:p>
-    <w:p>
-      <w:pPr>
-        <w:pStyle w:val="38"/>
-      </w:pPr>
-      <w:r>
-        <w:t>Returning one resalable milk item refunds CNY 6.50 and raises milk stock to 19. Retrying the same token returns the same refund receipt. Attempting to return two additional milk items fails because only one remains returnable. The live recording should show the console commands and explain these outcomes.</w:t>
-      </w:r>
-    </w:p>
-    <w:p>
-      <w:pPr>
-        <w:spacing w:before="80" w:after="80" w:line="240" w:lineRule="auto"/>
+        <w:t>The following screenshots document the student-operated console session using submission_demo_01.db. The sale receipt is S-848ee9285487. Original screenshot files are retained separately; the report displays selected regions to keep the commands and results readable.</w:t>
+      </w:r>
+    </w:p>
+    <w:p>
+      <w:pPr>
+        <w:pStyle w:val="38"/>
+      </w:pPr>
+      <w:r>
+        <w:t>Two MILK items at CNY 6.50 and one BREAD item at CNY 8.00 produce a total of CNY 21.00. The customer tenders CNY 30.00 and receives CNY 9.00 change. The receipt preserves both quantities and original unit prices.</w:t>
+      </w:r>
+    </w:p>
+    <w:p>
+      <w:pPr>
+        <w:spacing w:after="100" w:line="240" w:lineRule="auto"/>
+        <w:jc w:val="center"/>
       </w:pPr>
       <w:r>
         <w:drawing>
           <wp:inline distT="0" distB="0" distL="114300" distR="114300">
-            <wp:extent cx="5257800" cy="2117090"/>
+            <wp:extent cx="5257800" cy="3475990"/>
             <wp:effectExtent l="0" t="0" r="0" b="3810"/>
             <wp:docPr id="483976748" name="Picture 483976748"/>
             <wp:cNvGraphicFramePr>
@@ -5586,6 +5607,7 @@
                   </pic:nvPicPr>
                   <pic:blipFill>
                     <a:blip r:embed="rId21"/>
+                    <a:srcRect t="14000" r="49000" b="32000"/>
                     <a:stretch>
                       <a:fillRect/>
                     </a:stretch>
@@ -5593,7 +5615,7 @@
                   <pic:spPr>
                     <a:xfrm>
                       <a:off x="0" y="0"/>
-                      <a:ext cx="5257800" cy="2117141"/>
+                      <a:ext cx="5257800" cy="3476435"/>
                     </a:xfrm>
                     <a:prstGeom prst="rect">
                       <a:avLst/>
@@ -5608,6 +5630,8 @@
     </w:p>
     <w:p>
       <w:pPr>
+        <w:pStyle w:val="38"/>
+        <w:keepNext w:val="0"/>
         <w:spacing w:line="240" w:lineRule="auto"/>
         <w:jc w:val="center"/>
       </w:pPr>
@@ -5616,7 +5640,241 @@
           <w:rFonts w:ascii="Arial" w:hAnsi="Arial"/>
           <w:sz w:val="18"/>
         </w:rPr>
-        <w:t>Figure 10 Actual console execution transcript</w:t>
+        <w:t>Figure 10 Successful cash sale and receipt</w:t>
+      </w:r>
+    </w:p>
+    <w:p>
+      <w:pPr>
+        <w:pStyle w:val="3"/>
+        <w:pageBreakBefore/>
+      </w:pPr>
+      <w:r>
+        <w:t>Partial cash return</w:t>
+      </w:r>
+    </w:p>
+    <w:p>
+      <w:pPr>
+        <w:pStyle w:val="38"/>
+      </w:pPr>
+      <w:r>
+        <w:t>The cashier retrieves sale S-848ee9285487 and selects MILK quantity 1 with restock enabled. The resulting return R-66bcfa46a0d1 records a CNY 6.50 cash refund at the original unit price. The returned quantity is 1 and the restock flag is true.</w:t>
+      </w:r>
+    </w:p>
+    <w:p>
+      <w:pPr>
+        <w:spacing w:after="100" w:line="240" w:lineRule="auto"/>
+        <w:jc w:val="center"/>
+      </w:pPr>
+      <w:r>
+        <w:drawing>
+          <wp:inline distT="0" distB="0" distL="114300" distR="114300">
+            <wp:extent cx="5257800" cy="4482465"/>
+            <wp:effectExtent l="0" t="0" r="0" b="635"/>
+            <wp:docPr id="483976749" name="Picture 483976749"/>
+            <wp:cNvGraphicFramePr>
+              <a:graphicFrameLocks xmlns:a="http://schemas.openxmlformats.org/drawingml/2006/main" noChangeAspect="1"/>
+            </wp:cNvGraphicFramePr>
+            <a:graphic xmlns:a="http://schemas.openxmlformats.org/drawingml/2006/main">
+              <a:graphicData uri="http://schemas.openxmlformats.org/drawingml/2006/picture">
+                <pic:pic xmlns:pic="http://schemas.openxmlformats.org/drawingml/2006/picture">
+                  <pic:nvPicPr>
+                    <pic:cNvPr id="483976749" name="Picture 483976749"/>
+                    <pic:cNvPicPr>
+                      <a:picLocks noChangeAspect="1"/>
+                    </pic:cNvPicPr>
+                  </pic:nvPicPr>
+                  <pic:blipFill>
+                    <a:blip r:embed="rId22"/>
+                    <a:srcRect t="19000" r="48000" b="10000"/>
+                    <a:stretch>
+                      <a:fillRect/>
+                    </a:stretch>
+                  </pic:blipFill>
+                  <pic:spPr>
+                    <a:xfrm>
+                      <a:off x="0" y="0"/>
+                      <a:ext cx="5257800" cy="4482967"/>
+                    </a:xfrm>
+                    <a:prstGeom prst="rect">
+                      <a:avLst/>
+                    </a:prstGeom>
+                  </pic:spPr>
+                </pic:pic>
+              </a:graphicData>
+            </a:graphic>
+          </wp:inline>
+        </w:drawing>
+      </w:r>
+    </w:p>
+    <w:p>
+      <w:pPr>
+        <w:pStyle w:val="38"/>
+        <w:keepNext w:val="0"/>
+        <w:spacing w:line="240" w:lineRule="auto"/>
+        <w:jc w:val="center"/>
+      </w:pPr>
+      <w:r>
+        <w:rPr>
+          <w:rFonts w:ascii="Arial" w:hAnsi="Arial"/>
+          <w:sz w:val="18"/>
+        </w:rPr>
+        <w:t>Figure 11 Original-receipt partial return and refund</w:t>
+      </w:r>
+    </w:p>
+    <w:p>
+      <w:pPr>
+        <w:pStyle w:val="3"/>
+        <w:pageBreakBefore/>
+      </w:pPr>
+      <w:r>
+        <w:t>Inventory and cumulative returned quantities</w:t>
+      </w:r>
+    </w:p>
+    <w:p>
+      <w:pPr>
+        <w:pStyle w:val="38"/>
+      </w:pPr>
+      <w:r>
+        <w:t>After the sale and partial return, the catalog shows MILK stock 19 and BREAD stock 14. The original MILK line records purchased quantity 2 and already_returned quantity 1. The remaining return allowance is therefore 1. These values agree with one resalable milk item being put back into stock.</w:t>
+      </w:r>
+    </w:p>
+    <w:p>
+      <w:pPr>
+        <w:spacing w:after="100" w:line="240" w:lineRule="auto"/>
+        <w:jc w:val="center"/>
+      </w:pPr>
+      <w:r>
+        <w:drawing>
+          <wp:inline distT="0" distB="0" distL="114300" distR="114300">
+            <wp:extent cx="5257800" cy="2935605"/>
+            <wp:effectExtent l="0" t="0" r="0" b="10795"/>
+            <wp:docPr id="483976750" name="Picture 483976750"/>
+            <wp:cNvGraphicFramePr>
+              <a:graphicFrameLocks xmlns:a="http://schemas.openxmlformats.org/drawingml/2006/main" noChangeAspect="1"/>
+            </wp:cNvGraphicFramePr>
+            <a:graphic xmlns:a="http://schemas.openxmlformats.org/drawingml/2006/main">
+              <a:graphicData uri="http://schemas.openxmlformats.org/drawingml/2006/picture">
+                <pic:pic xmlns:pic="http://schemas.openxmlformats.org/drawingml/2006/picture">
+                  <pic:nvPicPr>
+                    <pic:cNvPr id="483976750" name="Picture 483976750"/>
+                    <pic:cNvPicPr>
+                      <a:picLocks noChangeAspect="1"/>
+                    </pic:cNvPicPr>
+                  </pic:nvPicPr>
+                  <pic:blipFill>
+                    <a:blip r:embed="rId23"/>
+                    <a:srcRect t="50000" r="48000" b="3500"/>
+                    <a:stretch>
+                      <a:fillRect/>
+                    </a:stretch>
+                  </pic:blipFill>
+                  <pic:spPr>
+                    <a:xfrm>
+                      <a:off x="0" y="0"/>
+                      <a:ext cx="5257800" cy="2936027"/>
+                    </a:xfrm>
+                    <a:prstGeom prst="rect">
+                      <a:avLst/>
+                    </a:prstGeom>
+                  </pic:spPr>
+                </pic:pic>
+              </a:graphicData>
+            </a:graphic>
+          </wp:inline>
+        </w:drawing>
+      </w:r>
+    </w:p>
+    <w:p>
+      <w:pPr>
+        <w:pStyle w:val="38"/>
+        <w:keepNext w:val="0"/>
+        <w:spacing w:line="240" w:lineRule="auto"/>
+        <w:jc w:val="center"/>
+      </w:pPr>
+      <w:r>
+        <w:rPr>
+          <w:rFonts w:ascii="Arial" w:hAnsi="Arial"/>
+          <w:sz w:val="18"/>
+        </w:rPr>
+        <w:t>Figure 12 Stock and original sale state after one-item return</w:t>
+      </w:r>
+    </w:p>
+    <w:p>
+      <w:pPr>
+        <w:pStyle w:val="3"/>
+        <w:pageBreakBefore/>
+      </w:pPr>
+      <w:r>
+        <w:t>Excessive return rejection</w:t>
+      </w:r>
+    </w:p>
+    <w:p>
+      <w:pPr>
+        <w:pStyle w:val="38"/>
+      </w:pPr>
+      <w:r>
+        <w:t>A second request attempts to return MILK quantity 2 against the same sale, although only 1 remains returnable. The controller rejects the request with the message shown. A subsequent catalog query still shows MILK stock 19 and BREAD stock 14, confirming that this rejected request did not alter saleable inventory.</w:t>
+      </w:r>
+    </w:p>
+    <w:p>
+      <w:pPr>
+        <w:spacing w:after="100" w:line="240" w:lineRule="auto"/>
+        <w:jc w:val="center"/>
+      </w:pPr>
+      <w:r>
+        <w:drawing>
+          <wp:inline distT="0" distB="0" distL="114300" distR="114300">
+            <wp:extent cx="5257800" cy="1007745"/>
+            <wp:effectExtent l="0" t="0" r="0" b="8255"/>
+            <wp:docPr id="483976751" name="Picture 483976751"/>
+            <wp:cNvGraphicFramePr>
+              <a:graphicFrameLocks xmlns:a="http://schemas.openxmlformats.org/drawingml/2006/main" noChangeAspect="1"/>
+            </wp:cNvGraphicFramePr>
+            <a:graphic xmlns:a="http://schemas.openxmlformats.org/drawingml/2006/main">
+              <a:graphicData uri="http://schemas.openxmlformats.org/drawingml/2006/picture">
+                <pic:pic xmlns:pic="http://schemas.openxmlformats.org/drawingml/2006/picture">
+                  <pic:nvPicPr>
+                    <pic:cNvPr id="483976751" name="Picture 483976751"/>
+                    <pic:cNvPicPr>
+                      <a:picLocks noChangeAspect="1"/>
+                    </pic:cNvPicPr>
+                  </pic:nvPicPr>
+                  <pic:blipFill>
+                    <a:blip r:embed="rId24"/>
+                    <a:srcRect t="73000" r="43000" b="9500"/>
+                    <a:stretch>
+                      <a:fillRect/>
+                    </a:stretch>
+                  </pic:blipFill>
+                  <pic:spPr>
+                    <a:xfrm>
+                      <a:off x="0" y="0"/>
+                      <a:ext cx="5257800" cy="1008030"/>
+                    </a:xfrm>
+                    <a:prstGeom prst="rect">
+                      <a:avLst/>
+                    </a:prstGeom>
+                  </pic:spPr>
+                </pic:pic>
+              </a:graphicData>
+            </a:graphic>
+          </wp:inline>
+        </w:drawing>
+      </w:r>
+    </w:p>
+    <w:p>
+      <w:pPr>
+        <w:pStyle w:val="38"/>
+        <w:keepNext w:val="0"/>
+        <w:spacing w:line="240" w:lineRule="auto"/>
+        <w:jc w:val="center"/>
+      </w:pPr>
+      <w:r>
+        <w:rPr>
+          <w:rFonts w:ascii="Arial" w:hAnsi="Arial"/>
+          <w:sz w:val="18"/>
+        </w:rPr>
+        <w:t>Figure 13 Excessive return rejected with inventory unchanged</w:t>
       </w:r>
     </w:p>
     <w:p>
@@ -5624,7 +5882,7 @@
         <w:pStyle w:val="2"/>
         <w:pageBreakBefore/>
       </w:pPr>
-      <w:bookmarkStart w:id="18" w:name="_Toc6521"/>
+      <w:bookmarkStart w:id="18" w:name="_Toc25883"/>
       <w:r>
         <w:t>19 Verification and traceability</w:t>
       </w:r>
@@ -5635,739 +5893,127 @@
         <w:pStyle w:val="38"/>
       </w:pPr>
       <w:r>
-        <w:t>Local validation on 19 October 2026 ran python -m unittest discover -s tests -v from the project folder. All 18 tests passed. Tests use isolated databases; one test closes and reopens a disk database to verify persistence. This result validates the listed cases and does not establish production readiness.</w:t>
-      </w:r>
-    </w:p>
-    <w:p>
-      <w:pPr>
-        <w:pStyle w:val="38"/>
-      </w:pPr>
-      <w:r>
-        <w:t>The automated checks assert outcomes such as persisted stock and return allowances, rather than only reproducing implementation calculations. The multi-line insufficient-stock test confirms that a failure after one stock update rolls back earlier updates and the sale header.</w:t>
-      </w:r>
-    </w:p>
-    <w:tbl>
-      <w:tblPr>
-        <w:tblStyle w:val="16"/>
-        <w:tblW w:w="0" w:type="auto"/>
-        <w:tblInd w:w="0" w:type="dxa"/>
-        <w:tblLayout w:type="fixed"/>
-        <w:tblCellMar>
-          <w:top w:w="0" w:type="dxa"/>
-          <w:left w:w="108" w:type="dxa"/>
-          <w:bottom w:w="0" w:type="dxa"/>
-          <w:right w:w="108" w:type="dxa"/>
-        </w:tblCellMar>
-      </w:tblPr>
-      <w:tblGrid>
-        <w:gridCol w:w="2088"/>
-        <w:gridCol w:w="6192"/>
-      </w:tblGrid>
-      <w:tr>
-        <w:tblPrEx>
-          <w:tblCellMar>
-            <w:top w:w="0" w:type="dxa"/>
-            <w:left w:w="108" w:type="dxa"/>
-            <w:bottom w:w="0" w:type="dxa"/>
-            <w:right w:w="108" w:type="dxa"/>
-          </w:tblCellMar>
-        </w:tblPrEx>
-        <w:trPr>
-          <w:cantSplit/>
-          <w:tblHeader/>
-        </w:trPr>
-        <w:tc>
-          <w:tcPr>
-            <w:tcW w:w="2088" w:type="dxa"/>
-            <w:tcBorders>
-              <w:top w:val="single" w:color="D9D9D9" w:sz="4" w:space="0"/>
-              <w:left w:val="single" w:color="D9D9D9" w:sz="4" w:space="0"/>
-              <w:bottom w:val="single" w:color="D9D9D9" w:sz="4" w:space="0"/>
-              <w:right w:val="single" w:color="D9D9D9" w:sz="4" w:space="0"/>
-            </w:tcBorders>
-            <w:shd w:val="clear" w:color="auto" w:fill="E8EEF5"/>
-            <w:tcMar>
-              <w:top w:w="80" w:type="dxa"/>
-              <w:left w:w="80" w:type="dxa"/>
-              <w:bottom w:w="80" w:type="dxa"/>
-              <w:right w:w="80" w:type="dxa"/>
-            </w:tcMar>
-            <w:vAlign w:val="center"/>
-          </w:tcPr>
-          <w:p>
-            <w:pPr>
-              <w:spacing w:after="40" w:line="240" w:lineRule="auto"/>
-              <w:jc w:val="left"/>
-            </w:pPr>
-            <w:r>
-              <w:rPr>
-                <w:rFonts w:ascii="Arial" w:hAnsi="Arial"/>
-                <w:b/>
-                <w:sz w:val="18"/>
-              </w:rPr>
-              <w:t>Requirement / story</w:t>
-            </w:r>
-          </w:p>
-        </w:tc>
-        <w:tc>
-          <w:tcPr>
-            <w:tcW w:w="6192" w:type="dxa"/>
-            <w:tcBorders>
-              <w:top w:val="single" w:color="D9D9D9" w:sz="4" w:space="0"/>
-              <w:left w:val="single" w:color="D9D9D9" w:sz="4" w:space="0"/>
-              <w:bottom w:val="single" w:color="D9D9D9" w:sz="4" w:space="0"/>
-              <w:right w:val="single" w:color="D9D9D9" w:sz="4" w:space="0"/>
-            </w:tcBorders>
-            <w:shd w:val="clear" w:color="auto" w:fill="E8EEF5"/>
-            <w:tcMar>
-              <w:top w:w="80" w:type="dxa"/>
-              <w:left w:w="80" w:type="dxa"/>
-              <w:bottom w:w="80" w:type="dxa"/>
-              <w:right w:w="80" w:type="dxa"/>
-            </w:tcMar>
-            <w:vAlign w:val="center"/>
-          </w:tcPr>
-          <w:p>
-            <w:pPr>
-              <w:spacing w:after="40" w:line="240" w:lineRule="auto"/>
-              <w:jc w:val="left"/>
-            </w:pPr>
-            <w:r>
-              <w:rPr>
-                <w:rFonts w:ascii="Arial" w:hAnsi="Arial"/>
-                <w:b/>
-                <w:sz w:val="18"/>
-              </w:rPr>
-              <w:t>Test coverage and observed result</w:t>
-            </w:r>
-          </w:p>
-        </w:tc>
-      </w:tr>
-      <w:tr>
-        <w:tblPrEx>
-          <w:tblCellMar>
-            <w:top w:w="0" w:type="dxa"/>
-            <w:left w:w="108" w:type="dxa"/>
-            <w:bottom w:w="0" w:type="dxa"/>
-            <w:right w:w="108" w:type="dxa"/>
-          </w:tblCellMar>
-        </w:tblPrEx>
-        <w:trPr>
-          <w:cantSplit/>
-        </w:trPr>
-        <w:tc>
-          <w:tcPr>
-            <w:tcW w:w="2088" w:type="dxa"/>
-            <w:tcBorders>
-              <w:top w:val="single" w:color="D9D9D9" w:sz="4" w:space="0"/>
-              <w:left w:val="single" w:color="D9D9D9" w:sz="4" w:space="0"/>
-              <w:bottom w:val="single" w:color="D9D9D9" w:sz="4" w:space="0"/>
-              <w:right w:val="single" w:color="D9D9D9" w:sz="4" w:space="0"/>
-            </w:tcBorders>
-            <w:tcMar>
-              <w:top w:w="80" w:type="dxa"/>
-              <w:left w:w="80" w:type="dxa"/>
-              <w:bottom w:w="80" w:type="dxa"/>
-              <w:right w:w="80" w:type="dxa"/>
-            </w:tcMar>
-            <w:vAlign w:val="center"/>
-          </w:tcPr>
-          <w:p>
-            <w:pPr>
-              <w:spacing w:after="40" w:line="240" w:lineRule="auto"/>
-              <w:jc w:val="left"/>
-            </w:pPr>
-            <w:r>
-              <w:rPr>
-                <w:rFonts w:ascii="Arial" w:hAnsi="Arial"/>
-                <w:b w:val="0"/>
-                <w:sz w:val="18"/>
-              </w:rPr>
-              <w:t>UC1 / US1, US4</w:t>
-            </w:r>
-          </w:p>
-        </w:tc>
-        <w:tc>
-          <w:tcPr>
-            <w:tcW w:w="6192" w:type="dxa"/>
-            <w:tcBorders>
-              <w:top w:val="single" w:color="D9D9D9" w:sz="4" w:space="0"/>
-              <w:left w:val="single" w:color="D9D9D9" w:sz="4" w:space="0"/>
-              <w:bottom w:val="single" w:color="D9D9D9" w:sz="4" w:space="0"/>
-              <w:right w:val="single" w:color="D9D9D9" w:sz="4" w:space="0"/>
-            </w:tcBorders>
-            <w:tcMar>
-              <w:top w:w="80" w:type="dxa"/>
-              <w:left w:w="80" w:type="dxa"/>
-              <w:bottom w:w="80" w:type="dxa"/>
-              <w:right w:w="80" w:type="dxa"/>
-            </w:tcMar>
-            <w:vAlign w:val="center"/>
-          </w:tcPr>
-          <w:p>
-            <w:pPr>
-              <w:spacing w:after="40" w:line="240" w:lineRule="auto"/>
-              <w:jc w:val="left"/>
-            </w:pPr>
-            <w:r>
-              <w:rPr>
-                <w:rFonts w:ascii="Arial" w:hAnsi="Arial"/>
-                <w:b w:val="0"/>
-                <w:sz w:val="18"/>
-              </w:rPr>
-              <w:t>Unknown product and empty sale rejected; totals, receipt values and change correct</w:t>
-            </w:r>
-          </w:p>
-        </w:tc>
-      </w:tr>
-      <w:tr>
-        <w:tblPrEx>
-          <w:tblCellMar>
-            <w:top w:w="0" w:type="dxa"/>
-            <w:left w:w="108" w:type="dxa"/>
-            <w:bottom w:w="0" w:type="dxa"/>
-            <w:right w:w="108" w:type="dxa"/>
-          </w:tblCellMar>
-        </w:tblPrEx>
-        <w:trPr>
-          <w:cantSplit/>
-        </w:trPr>
-        <w:tc>
-          <w:tcPr>
-            <w:tcW w:w="2088" w:type="dxa"/>
-            <w:tcBorders>
-              <w:top w:val="single" w:color="D9D9D9" w:sz="4" w:space="0"/>
-              <w:left w:val="single" w:color="D9D9D9" w:sz="4" w:space="0"/>
-              <w:bottom w:val="single" w:color="D9D9D9" w:sz="4" w:space="0"/>
-              <w:right w:val="single" w:color="D9D9D9" w:sz="4" w:space="0"/>
-            </w:tcBorders>
-            <w:tcMar>
-              <w:top w:w="80" w:type="dxa"/>
-              <w:left w:w="80" w:type="dxa"/>
-              <w:bottom w:w="80" w:type="dxa"/>
-              <w:right w:w="80" w:type="dxa"/>
-            </w:tcMar>
-            <w:vAlign w:val="center"/>
-          </w:tcPr>
-          <w:p>
-            <w:pPr>
-              <w:spacing w:after="40" w:line="240" w:lineRule="auto"/>
-              <w:jc w:val="left"/>
-            </w:pPr>
-            <w:r>
-              <w:rPr>
-                <w:rFonts w:ascii="Arial" w:hAnsi="Arial"/>
-                <w:b w:val="0"/>
-                <w:sz w:val="18"/>
-              </w:rPr>
-              <w:t>UC1 / US2</w:t>
-            </w:r>
-          </w:p>
-        </w:tc>
-        <w:tc>
-          <w:tcPr>
-            <w:tcW w:w="6192" w:type="dxa"/>
-            <w:tcBorders>
-              <w:top w:val="single" w:color="D9D9D9" w:sz="4" w:space="0"/>
-              <w:left w:val="single" w:color="D9D9D9" w:sz="4" w:space="0"/>
-              <w:bottom w:val="single" w:color="D9D9D9" w:sz="4" w:space="0"/>
-              <w:right w:val="single" w:color="D9D9D9" w:sz="4" w:space="0"/>
-            </w:tcBorders>
-            <w:tcMar>
-              <w:top w:w="80" w:type="dxa"/>
-              <w:left w:w="80" w:type="dxa"/>
-              <w:bottom w:w="80" w:type="dxa"/>
-              <w:right w:w="80" w:type="dxa"/>
-            </w:tcMar>
-            <w:vAlign w:val="center"/>
-          </w:tcPr>
-          <w:p>
-            <w:pPr>
-              <w:spacing w:after="40" w:line="240" w:lineRule="auto"/>
-              <w:jc w:val="left"/>
-            </w:pPr>
-            <w:r>
-              <w:rPr>
-                <w:rFonts w:ascii="Arial" w:hAnsi="Arial"/>
-                <w:b w:val="0"/>
-                <w:sz w:val="18"/>
-              </w:rPr>
-              <w:t>Underpayment has no persistent effect; already-paid sale blocks another payment token</w:t>
-            </w:r>
-          </w:p>
-        </w:tc>
-      </w:tr>
-      <w:tr>
-        <w:tblPrEx>
-          <w:tblCellMar>
-            <w:top w:w="0" w:type="dxa"/>
-            <w:left w:w="108" w:type="dxa"/>
-            <w:bottom w:w="0" w:type="dxa"/>
-            <w:right w:w="108" w:type="dxa"/>
-          </w:tblCellMar>
-        </w:tblPrEx>
-        <w:trPr>
-          <w:cantSplit/>
-        </w:trPr>
-        <w:tc>
-          <w:tcPr>
-            <w:tcW w:w="2088" w:type="dxa"/>
-            <w:tcBorders>
-              <w:top w:val="single" w:color="D9D9D9" w:sz="4" w:space="0"/>
-              <w:left w:val="single" w:color="D9D9D9" w:sz="4" w:space="0"/>
-              <w:bottom w:val="single" w:color="D9D9D9" w:sz="4" w:space="0"/>
-              <w:right w:val="single" w:color="D9D9D9" w:sz="4" w:space="0"/>
-            </w:tcBorders>
-            <w:tcMar>
-              <w:top w:w="80" w:type="dxa"/>
-              <w:left w:w="80" w:type="dxa"/>
-              <w:bottom w:w="80" w:type="dxa"/>
-              <w:right w:w="80" w:type="dxa"/>
-            </w:tcMar>
-            <w:vAlign w:val="center"/>
-          </w:tcPr>
-          <w:p>
-            <w:pPr>
-              <w:spacing w:after="40" w:line="240" w:lineRule="auto"/>
-              <w:jc w:val="left"/>
-            </w:pPr>
-            <w:r>
-              <w:rPr>
-                <w:rFonts w:ascii="Arial" w:hAnsi="Arial"/>
-                <w:b w:val="0"/>
-                <w:sz w:val="18"/>
-              </w:rPr>
-              <w:t>UC1 / US3</w:t>
-            </w:r>
-          </w:p>
-        </w:tc>
-        <w:tc>
-          <w:tcPr>
-            <w:tcW w:w="6192" w:type="dxa"/>
-            <w:tcBorders>
-              <w:top w:val="single" w:color="D9D9D9" w:sz="4" w:space="0"/>
-              <w:left w:val="single" w:color="D9D9D9" w:sz="4" w:space="0"/>
-              <w:bottom w:val="single" w:color="D9D9D9" w:sz="4" w:space="0"/>
-              <w:right w:val="single" w:color="D9D9D9" w:sz="4" w:space="0"/>
-            </w:tcBorders>
-            <w:tcMar>
-              <w:top w:w="80" w:type="dxa"/>
-              <w:left w:w="80" w:type="dxa"/>
-              <w:bottom w:w="80" w:type="dxa"/>
-              <w:right w:w="80" w:type="dxa"/>
-            </w:tcMar>
-            <w:vAlign w:val="center"/>
-          </w:tcPr>
-          <w:p>
-            <w:pPr>
-              <w:spacing w:after="40" w:line="240" w:lineRule="auto"/>
-              <w:jc w:val="left"/>
-            </w:pPr>
-            <w:r>
-              <w:rPr>
-                <w:rFonts w:ascii="Arial" w:hAnsi="Arial"/>
-                <w:b w:val="0"/>
-                <w:sz w:val="18"/>
-              </w:rPr>
-              <w:t>Insufficient stock rolls back all lines; cancellation leaves stock unchanged; reopen retains sale</w:t>
-            </w:r>
-          </w:p>
-        </w:tc>
-      </w:tr>
-      <w:tr>
-        <w:tblPrEx>
-          <w:tblCellMar>
-            <w:top w:w="0" w:type="dxa"/>
-            <w:left w:w="108" w:type="dxa"/>
-            <w:bottom w:w="0" w:type="dxa"/>
-            <w:right w:w="108" w:type="dxa"/>
-          </w:tblCellMar>
-        </w:tblPrEx>
-        <w:trPr>
-          <w:cantSplit/>
-        </w:trPr>
-        <w:tc>
-          <w:tcPr>
-            <w:tcW w:w="2088" w:type="dxa"/>
-            <w:tcBorders>
-              <w:top w:val="single" w:color="D9D9D9" w:sz="4" w:space="0"/>
-              <w:left w:val="single" w:color="D9D9D9" w:sz="4" w:space="0"/>
-              <w:bottom w:val="single" w:color="D9D9D9" w:sz="4" w:space="0"/>
-              <w:right w:val="single" w:color="D9D9D9" w:sz="4" w:space="0"/>
-            </w:tcBorders>
-            <w:tcMar>
-              <w:top w:w="80" w:type="dxa"/>
-              <w:left w:w="80" w:type="dxa"/>
-              <w:bottom w:w="80" w:type="dxa"/>
-              <w:right w:w="80" w:type="dxa"/>
-            </w:tcMar>
-            <w:vAlign w:val="center"/>
-          </w:tcPr>
-          <w:p>
-            <w:pPr>
-              <w:spacing w:after="40" w:line="240" w:lineRule="auto"/>
-              <w:jc w:val="left"/>
-            </w:pPr>
-            <w:r>
-              <w:rPr>
-                <w:rFonts w:ascii="Arial" w:hAnsi="Arial"/>
-                <w:b w:val="0"/>
-                <w:sz w:val="18"/>
-              </w:rPr>
-              <w:t>UC2 / US5, US6</w:t>
-            </w:r>
-          </w:p>
-        </w:tc>
-        <w:tc>
-          <w:tcPr>
-            <w:tcW w:w="6192" w:type="dxa"/>
-            <w:tcBorders>
-              <w:top w:val="single" w:color="D9D9D9" w:sz="4" w:space="0"/>
-              <w:left w:val="single" w:color="D9D9D9" w:sz="4" w:space="0"/>
-              <w:bottom w:val="single" w:color="D9D9D9" w:sz="4" w:space="0"/>
-              <w:right w:val="single" w:color="D9D9D9" w:sz="4" w:space="0"/>
-            </w:tcBorders>
-            <w:tcMar>
-              <w:top w:w="80" w:type="dxa"/>
-              <w:left w:w="80" w:type="dxa"/>
-              <w:bottom w:w="80" w:type="dxa"/>
-              <w:right w:w="80" w:type="dxa"/>
-            </w:tcMar>
-            <w:vAlign w:val="center"/>
-          </w:tcPr>
-          <w:p>
-            <w:pPr>
-              <w:spacing w:after="40" w:line="240" w:lineRule="auto"/>
-              <w:jc w:val="left"/>
-            </w:pPr>
-            <w:r>
-              <w:rPr>
-                <w:rFonts w:ascii="Arial" w:hAnsi="Arial"/>
-                <w:b w:val="0"/>
-                <w:sz w:val="18"/>
-              </w:rPr>
-              <w:t>Missing receipt, unpurchased product, duplicate SKU and over-return rejected</w:t>
-            </w:r>
-          </w:p>
-        </w:tc>
-      </w:tr>
-      <w:tr>
-        <w:tblPrEx>
-          <w:tblCellMar>
-            <w:top w:w="0" w:type="dxa"/>
-            <w:left w:w="108" w:type="dxa"/>
-            <w:bottom w:w="0" w:type="dxa"/>
-            <w:right w:w="108" w:type="dxa"/>
-          </w:tblCellMar>
-        </w:tblPrEx>
-        <w:trPr>
-          <w:cantSplit/>
-        </w:trPr>
-        <w:tc>
-          <w:tcPr>
-            <w:tcW w:w="2088" w:type="dxa"/>
-            <w:tcBorders>
-              <w:top w:val="single" w:color="D9D9D9" w:sz="4" w:space="0"/>
-              <w:left w:val="single" w:color="D9D9D9" w:sz="4" w:space="0"/>
-              <w:bottom w:val="single" w:color="D9D9D9" w:sz="4" w:space="0"/>
-              <w:right w:val="single" w:color="D9D9D9" w:sz="4" w:space="0"/>
-            </w:tcBorders>
-            <w:tcMar>
-              <w:top w:w="80" w:type="dxa"/>
-              <w:left w:w="80" w:type="dxa"/>
-              <w:bottom w:w="80" w:type="dxa"/>
-              <w:right w:w="80" w:type="dxa"/>
-            </w:tcMar>
-            <w:vAlign w:val="center"/>
-          </w:tcPr>
-          <w:p>
-            <w:pPr>
-              <w:spacing w:after="40" w:line="240" w:lineRule="auto"/>
-              <w:jc w:val="left"/>
-            </w:pPr>
-            <w:r>
-              <w:rPr>
-                <w:rFonts w:ascii="Arial" w:hAnsi="Arial"/>
-                <w:b w:val="0"/>
-                <w:sz w:val="18"/>
-              </w:rPr>
-              <w:t>UC2 / US6</w:t>
-            </w:r>
-          </w:p>
-        </w:tc>
-        <w:tc>
-          <w:tcPr>
-            <w:tcW w:w="6192" w:type="dxa"/>
-            <w:tcBorders>
-              <w:top w:val="single" w:color="D9D9D9" w:sz="4" w:space="0"/>
-              <w:left w:val="single" w:color="D9D9D9" w:sz="4" w:space="0"/>
-              <w:bottom w:val="single" w:color="D9D9D9" w:sz="4" w:space="0"/>
-              <w:right w:val="single" w:color="D9D9D9" w:sz="4" w:space="0"/>
-            </w:tcBorders>
-            <w:tcMar>
-              <w:top w:w="80" w:type="dxa"/>
-              <w:left w:w="80" w:type="dxa"/>
-              <w:bottom w:w="80" w:type="dxa"/>
-              <w:right w:w="80" w:type="dxa"/>
-            </w:tcMar>
-            <w:vAlign w:val="center"/>
-          </w:tcPr>
-          <w:p>
-            <w:pPr>
-              <w:spacing w:after="40" w:line="240" w:lineRule="auto"/>
-              <w:jc w:val="left"/>
-            </w:pPr>
-            <w:r>
-              <w:rPr>
-                <w:rFonts w:ascii="Arial" w:hAnsi="Arial"/>
-                <w:b w:val="0"/>
-                <w:sz w:val="18"/>
-              </w:rPr>
-              <w:t>Day 30 accepted; day 31 rejected</w:t>
-            </w:r>
-          </w:p>
-        </w:tc>
-      </w:tr>
-      <w:tr>
-        <w:tblPrEx>
-          <w:tblCellMar>
-            <w:top w:w="0" w:type="dxa"/>
-            <w:left w:w="108" w:type="dxa"/>
-            <w:bottom w:w="0" w:type="dxa"/>
-            <w:right w:w="108" w:type="dxa"/>
-          </w:tblCellMar>
-        </w:tblPrEx>
-        <w:trPr>
-          <w:cantSplit/>
-        </w:trPr>
-        <w:tc>
-          <w:tcPr>
-            <w:tcW w:w="2088" w:type="dxa"/>
-            <w:tcBorders>
-              <w:top w:val="single" w:color="D9D9D9" w:sz="4" w:space="0"/>
-              <w:left w:val="single" w:color="D9D9D9" w:sz="4" w:space="0"/>
-              <w:bottom w:val="single" w:color="D9D9D9" w:sz="4" w:space="0"/>
-              <w:right w:val="single" w:color="D9D9D9" w:sz="4" w:space="0"/>
-            </w:tcBorders>
-            <w:tcMar>
-              <w:top w:w="80" w:type="dxa"/>
-              <w:left w:w="80" w:type="dxa"/>
-              <w:bottom w:w="80" w:type="dxa"/>
-              <w:right w:w="80" w:type="dxa"/>
-            </w:tcMar>
-            <w:vAlign w:val="center"/>
-          </w:tcPr>
-          <w:p>
-            <w:pPr>
-              <w:spacing w:after="40" w:line="240" w:lineRule="auto"/>
-              <w:jc w:val="left"/>
-            </w:pPr>
-            <w:r>
-              <w:rPr>
-                <w:rFonts w:ascii="Arial" w:hAnsi="Arial"/>
-                <w:b w:val="0"/>
-                <w:sz w:val="18"/>
-              </w:rPr>
-              <w:t>UC2 / US7</w:t>
-            </w:r>
-          </w:p>
-        </w:tc>
-        <w:tc>
-          <w:tcPr>
-            <w:tcW w:w="6192" w:type="dxa"/>
-            <w:tcBorders>
-              <w:top w:val="single" w:color="D9D9D9" w:sz="4" w:space="0"/>
-              <w:left w:val="single" w:color="D9D9D9" w:sz="4" w:space="0"/>
-              <w:bottom w:val="single" w:color="D9D9D9" w:sz="4" w:space="0"/>
-              <w:right w:val="single" w:color="D9D9D9" w:sz="4" w:space="0"/>
-            </w:tcBorders>
-            <w:tcMar>
-              <w:top w:w="80" w:type="dxa"/>
-              <w:left w:w="80" w:type="dxa"/>
-              <w:bottom w:w="80" w:type="dxa"/>
-              <w:right w:w="80" w:type="dxa"/>
-            </w:tcMar>
-            <w:vAlign w:val="center"/>
-          </w:tcPr>
-          <w:p>
-            <w:pPr>
-              <w:spacing w:after="40" w:line="240" w:lineRule="auto"/>
-              <w:jc w:val="left"/>
-            </w:pPr>
-            <w:r>
-              <w:rPr>
-                <w:rFonts w:ascii="Arial" w:hAnsi="Arial"/>
-                <w:b w:val="0"/>
-                <w:sz w:val="18"/>
-              </w:rPr>
-              <w:t>Partial refund uses original price after catalog change; damaged goods do not restock</w:t>
-            </w:r>
-          </w:p>
-        </w:tc>
-      </w:tr>
-      <w:tr>
-        <w:tblPrEx>
-          <w:tblCellMar>
-            <w:top w:w="0" w:type="dxa"/>
-            <w:left w:w="108" w:type="dxa"/>
-            <w:bottom w:w="0" w:type="dxa"/>
-            <w:right w:w="108" w:type="dxa"/>
-          </w:tblCellMar>
-        </w:tblPrEx>
-        <w:trPr>
-          <w:cantSplit/>
-        </w:trPr>
-        <w:tc>
-          <w:tcPr>
-            <w:tcW w:w="2088" w:type="dxa"/>
-            <w:tcBorders>
-              <w:top w:val="single" w:color="D9D9D9" w:sz="4" w:space="0"/>
-              <w:left w:val="single" w:color="D9D9D9" w:sz="4" w:space="0"/>
-              <w:bottom w:val="single" w:color="D9D9D9" w:sz="4" w:space="0"/>
-              <w:right w:val="single" w:color="D9D9D9" w:sz="4" w:space="0"/>
-            </w:tcBorders>
-            <w:tcMar>
-              <w:top w:w="80" w:type="dxa"/>
-              <w:left w:w="80" w:type="dxa"/>
-              <w:bottom w:w="80" w:type="dxa"/>
-              <w:right w:w="80" w:type="dxa"/>
-            </w:tcMar>
-            <w:vAlign w:val="center"/>
-          </w:tcPr>
-          <w:p>
-            <w:pPr>
-              <w:spacing w:after="40" w:line="240" w:lineRule="auto"/>
-              <w:jc w:val="left"/>
-            </w:pPr>
-            <w:r>
-              <w:rPr>
-                <w:rFonts w:ascii="Arial" w:hAnsi="Arial"/>
-                <w:b w:val="0"/>
-                <w:sz w:val="18"/>
-              </w:rPr>
-              <w:t>UC1 and UC2 / US8</w:t>
-            </w:r>
-          </w:p>
-        </w:tc>
-        <w:tc>
-          <w:tcPr>
-            <w:tcW w:w="6192" w:type="dxa"/>
-            <w:tcBorders>
-              <w:top w:val="single" w:color="D9D9D9" w:sz="4" w:space="0"/>
-              <w:left w:val="single" w:color="D9D9D9" w:sz="4" w:space="0"/>
-              <w:bottom w:val="single" w:color="D9D9D9" w:sz="4" w:space="0"/>
-              <w:right w:val="single" w:color="D9D9D9" w:sz="4" w:space="0"/>
-            </w:tcBorders>
-            <w:tcMar>
-              <w:top w:w="80" w:type="dxa"/>
-              <w:left w:w="80" w:type="dxa"/>
-              <w:bottom w:w="80" w:type="dxa"/>
-              <w:right w:w="80" w:type="dxa"/>
-            </w:tcMar>
-            <w:vAlign w:val="center"/>
-          </w:tcPr>
-          <w:p>
-            <w:pPr>
-              <w:spacing w:after="40" w:line="240" w:lineRule="auto"/>
-              <w:jc w:val="left"/>
-            </w:pPr>
-            <w:r>
-              <w:rPr>
-                <w:rFonts w:ascii="Arial" w:hAnsi="Arial"/>
-                <w:b w:val="0"/>
-                <w:sz w:val="18"/>
-              </w:rPr>
-              <w:t>Exact payment and return replay returns saved receipt; conflicting return token rejected</w:t>
-            </w:r>
-          </w:p>
-        </w:tc>
-      </w:tr>
-      <w:tr>
-        <w:tblPrEx>
-          <w:tblCellMar>
-            <w:top w:w="0" w:type="dxa"/>
-            <w:left w:w="108" w:type="dxa"/>
-            <w:bottom w:w="0" w:type="dxa"/>
-            <w:right w:w="108" w:type="dxa"/>
-          </w:tblCellMar>
-        </w:tblPrEx>
-        <w:trPr>
-          <w:cantSplit/>
-        </w:trPr>
-        <w:tc>
-          <w:tcPr>
-            <w:tcW w:w="2088" w:type="dxa"/>
-            <w:tcBorders>
-              <w:top w:val="single" w:color="D9D9D9" w:sz="4" w:space="0"/>
-              <w:left w:val="single" w:color="D9D9D9" w:sz="4" w:space="0"/>
-              <w:bottom w:val="single" w:color="D9D9D9" w:sz="4" w:space="0"/>
-              <w:right w:val="single" w:color="D9D9D9" w:sz="4" w:space="0"/>
-            </w:tcBorders>
-            <w:tcMar>
-              <w:top w:w="80" w:type="dxa"/>
-              <w:left w:w="80" w:type="dxa"/>
-              <w:bottom w:w="80" w:type="dxa"/>
-              <w:right w:w="80" w:type="dxa"/>
-            </w:tcMar>
-            <w:vAlign w:val="center"/>
-          </w:tcPr>
-          <w:p>
-            <w:pPr>
-              <w:spacing w:after="40" w:line="240" w:lineRule="auto"/>
-              <w:jc w:val="left"/>
-            </w:pPr>
-            <w:r>
-              <w:rPr>
-                <w:rFonts w:ascii="Arial" w:hAnsi="Arial"/>
-                <w:b w:val="0"/>
-                <w:sz w:val="18"/>
-              </w:rPr>
-              <w:t>Input rules</w:t>
-            </w:r>
-          </w:p>
-        </w:tc>
-        <w:tc>
-          <w:tcPr>
-            <w:tcW w:w="6192" w:type="dxa"/>
-            <w:tcBorders>
-              <w:top w:val="single" w:color="D9D9D9" w:sz="4" w:space="0"/>
-              <w:left w:val="single" w:color="D9D9D9" w:sz="4" w:space="0"/>
-              <w:bottom w:val="single" w:color="D9D9D9" w:sz="4" w:space="0"/>
-              <w:right w:val="single" w:color="D9D9D9" w:sz="4" w:space="0"/>
-            </w:tcBorders>
-            <w:tcMar>
-              <w:top w:w="80" w:type="dxa"/>
-              <w:left w:w="80" w:type="dxa"/>
-              <w:bottom w:w="80" w:type="dxa"/>
-              <w:right w:w="80" w:type="dxa"/>
-            </w:tcMar>
-            <w:vAlign w:val="center"/>
-          </w:tcPr>
-          <w:p>
-            <w:pPr>
-              <w:spacing w:after="40" w:line="240" w:lineRule="auto"/>
-              <w:jc w:val="left"/>
-            </w:pPr>
-            <w:r>
-              <w:rPr>
-                <w:rFonts w:ascii="Arial" w:hAnsi="Arial"/>
-                <w:b w:val="0"/>
-                <w:sz w:val="18"/>
-              </w:rPr>
-              <w:t>Zero, negative, fractional and Boolean quantities rejected; invalid monetary inputs rejected</w:t>
-            </w:r>
-          </w:p>
-        </w:tc>
-      </w:tr>
-    </w:tbl>
+        <w:t>The student ran python -m unittest discover -s tests -v from the project folder. The screenshot shows all 18 tests passing in 0.079 seconds and the final OK result. This is the actual observed test run; the elapsed time is not a general performance benchmark.</w:t>
+      </w:r>
+    </w:p>
+    <w:p>
+      <w:pPr>
+        <w:pStyle w:val="38"/>
+      </w:pPr>
+      <w:r>
+        <w:t>The suite covers sale totals and change, invalid quantities and money, unknown products, empty and cancelled sales, underpayment, multi-line stock rollback, persistence after reopening, original-price partial refunds, damaged-goods handling, missing receipts and unpurchased products, over-returns, duplicate SKU selection, return date boundaries, exact replays and conflicting tokens.</w:t>
+      </w:r>
+    </w:p>
+    <w:p>
+      <w:pPr>
+        <w:spacing w:after="100" w:line="240" w:lineRule="auto"/>
+        <w:jc w:val="center"/>
+      </w:pPr>
+      <w:r>
+        <w:drawing>
+          <wp:inline distT="0" distB="0" distL="114300" distR="114300">
+            <wp:extent cx="5257800" cy="1411605"/>
+            <wp:effectExtent l="0" t="0" r="0" b="10795"/>
+            <wp:docPr id="483976752" name="Picture 483976752"/>
+            <wp:cNvGraphicFramePr>
+              <a:graphicFrameLocks xmlns:a="http://schemas.openxmlformats.org/drawingml/2006/main" noChangeAspect="1"/>
+            </wp:cNvGraphicFramePr>
+            <a:graphic xmlns:a="http://schemas.openxmlformats.org/drawingml/2006/main">
+              <a:graphicData uri="http://schemas.openxmlformats.org/drawingml/2006/picture">
+                <pic:pic xmlns:pic="http://schemas.openxmlformats.org/drawingml/2006/picture">
+                  <pic:nvPicPr>
+                    <pic:cNvPr id="483976752" name="Picture 483976752"/>
+                    <pic:cNvPicPr>
+                      <a:picLocks noChangeAspect="1"/>
+                    </pic:cNvPicPr>
+                  </pic:nvPicPr>
+                  <pic:blipFill>
+                    <a:blip r:embed="rId25"/>
+                    <a:srcRect t="3000" b="54000"/>
+                    <a:stretch>
+                      <a:fillRect/>
+                    </a:stretch>
+                  </pic:blipFill>
+                  <pic:spPr>
+                    <a:xfrm>
+                      <a:off x="0" y="0"/>
+                      <a:ext cx="5257800" cy="1411818"/>
+                    </a:xfrm>
+                    <a:prstGeom prst="rect">
+                      <a:avLst/>
+                    </a:prstGeom>
+                  </pic:spPr>
+                </pic:pic>
+              </a:graphicData>
+            </a:graphic>
+          </wp:inline>
+        </w:drawing>
+      </w:r>
+    </w:p>
+    <w:p>
+      <w:pPr>
+        <w:pStyle w:val="38"/>
+        <w:keepNext w:val="0"/>
+        <w:spacing w:line="240" w:lineRule="auto"/>
+        <w:jc w:val="center"/>
+      </w:pPr>
+      <w:r>
+        <w:rPr>
+          <w:rFonts w:ascii="Arial" w:hAnsi="Arial"/>
+          <w:sz w:val="18"/>
+        </w:rPr>
+        <w:t>Figure 14 Student-run automated test results</w:t>
+      </w:r>
+    </w:p>
+    <w:p>
+      <w:pPr>
+        <w:pStyle w:val="3"/>
+        <w:pageBreakBefore/>
+      </w:pPr>
+      <w:r>
+        <w:t>Requirements linked to verified behavior</w:t>
+      </w:r>
+    </w:p>
+    <w:p>
+      <w:pPr>
+        <w:pStyle w:val="38"/>
+      </w:pPr>
+      <w:r>
+        <w:t>UC1 and US1-US4 are supported by the cash-sale screenshot and tests for totals, input rejection, payment, stock and persistence. UC2 and US5-US7 are supported by the refund, stock and rejection screenshots and tests for return eligibility and historical prices.</w:t>
+      </w:r>
+    </w:p>
+    <w:p>
+      <w:pPr>
+        <w:pStyle w:val="38"/>
+      </w:pPr>
+      <w:r>
+        <w:t>US8 is checked by the sale and return replay tests and token-conflict test. The student-operated screenshots show a fresh confirmed return rather than an exact token replay. The isolated --demo scenario separately exercises an intentional return replay.</w:t>
+      </w:r>
+    </w:p>
+    <w:p>
+      <w:pPr>
+        <w:pStyle w:val="38"/>
+      </w:pPr>
+      <w:r>
+        <w:t>US9 is represented by the use cases, domain model, logical layers and design interactions in this report. US10 is documented by the recorded slide-led presentation and its linked program demonstration. Planned sprint days and the ideal burndown remain planning artifacts; no daily actual sprint measurements are inferred from the tests or Git history.</w:t>
+      </w:r>
+    </w:p>
+    <w:p>
+      <w:pPr>
+        <w:pStyle w:val="38"/>
+      </w:pPr>
+      <w:r>
+        <w:t>The tests and screenshots demonstrate the stated examples and invariants. They do not establish production readiness, security assurance or a multi-client concurrency stress-test result.</w:t>
+      </w:r>
+    </w:p>
     <w:p>
       <w:pPr>
         <w:pStyle w:val="2"/>
         <w:pageBreakBefore/>
       </w:pPr>
-      <w:bookmarkStart w:id="19" w:name="_Toc11849"/>
-      <w:r>
-        <w:t>20 Git evidence and submission completion</w:t>
+      <w:bookmarkStart w:id="19" w:name="_Toc18310"/>
+      <w:r>
+        <w:t>20 Git repository and command evidence</w:t>
       </w:r>
       <w:bookmarkEnd w:id="19"/>
     </w:p>
@@ -6376,39 +6022,315 @@
         <w:pStyle w:val="38"/>
       </w:pPr>
       <w:r>
-        <w:t>The user-created remote repository is https://github.com/denniswang12345/ProjectPos_2026. The included Git guide explains how to initialize the supplied local project, create a personal branch, commit real changes, merge with --no-ff and push main and the retained branch. No additional contributors, old commits or fabricated sprint dates should be introduced.</w:t>
-      </w:r>
-    </w:p>
-    <w:p>
-      <w:pPr>
-        <w:pStyle w:val="38"/>
-      </w:pPr>
-      <w:r>
-        <w:t>Git evidence must come from the actual local and remote operations. Capture git log --all --graph --decorate --oneline and git log --all --format="%h %an &lt;%ae&gt; %ad %s" --date=iso. Keep a separate PowerShell transcript for commands because git log records commits rather than the command history. Push the personal branch and retain it after merge as requested.</w:t>
-      </w:r>
-    </w:p>
-    <w:p>
-      <w:pPr>
-        <w:pStyle w:val="38"/>
-      </w:pPr>
-      <w:r>
-        <w:t>Before final submission, verify that the remote has the report, slides, source and tests, add the actual bilibili presentation URL to the cover, and include genuine Git command-history evidence. If the instructor requires recorded sprint progress, replace the not-recorded actual burndown cells with measured values and attach real review notes.</w:t>
-      </w:r>
-    </w:p>
-    <w:p>
-      <w:pPr>
-        <w:pStyle w:val="38"/>
-      </w:pPr>
-      <w:r>
-        <w:t>The presentation should explain the problem, cash-sale analysis, original-receipt return design, responsibilities and transaction rules, then demonstrate the program. It should use slides and live behavior, as requested by the assignment, rather than narrating the report page by page. The separate recording script provides a suggested sequence.</w:t>
-      </w:r>
-    </w:p>
-    <w:p>
-      <w:pPr>
-        <w:pStyle w:val="38"/>
-      </w:pPr>
-      <w:r>
-        <w:t>Individual submission and scope interpretation: the assignment labels implementation optional but also asks for source code and component evidence. This package includes a working implementation to cover both statements. The video remains an actual recording and upload task for the student.</w:t>
+        <w:t>The project has been pushed to https://github.com/denniswang12345/ProjectPos_2026. The Code page screenshot shows the main branch and the source, tests, UML documentation and submission folders. It was captured before the final cleanup merge; the subsequent history screenshot records the later synchronized main commit.</w:t>
+      </w:r>
+    </w:p>
+    <w:p>
+      <w:pPr>
+        <w:pStyle w:val="38"/>
+      </w:pPr>
+      <w:r>
+        <w:t>The project has one actual contributor, Wang Hao. The personal development branch is feature/wanghao-pos and is retained after merging. The following pages show the final default-branch setting and the real commit graph.</w:t>
+      </w:r>
+    </w:p>
+    <w:p>
+      <w:pPr>
+        <w:spacing w:after="100" w:line="240" w:lineRule="auto"/>
+        <w:jc w:val="center"/>
+      </w:pPr>
+      <w:r>
+        <w:drawing>
+          <wp:inline distT="0" distB="0" distL="114300" distR="114300">
+            <wp:extent cx="5257800" cy="2764790"/>
+            <wp:effectExtent l="0" t="0" r="0" b="3810"/>
+            <wp:docPr id="483976753" name="Picture 483976753"/>
+            <wp:cNvGraphicFramePr>
+              <a:graphicFrameLocks xmlns:a="http://schemas.openxmlformats.org/drawingml/2006/main" noChangeAspect="1"/>
+            </wp:cNvGraphicFramePr>
+            <a:graphic xmlns:a="http://schemas.openxmlformats.org/drawingml/2006/main">
+              <a:graphicData uri="http://schemas.openxmlformats.org/drawingml/2006/picture">
+                <pic:pic xmlns:pic="http://schemas.openxmlformats.org/drawingml/2006/picture">
+                  <pic:nvPicPr>
+                    <pic:cNvPr id="483976753" name="Picture 483976753"/>
+                    <pic:cNvPicPr>
+                      <a:picLocks noChangeAspect="1"/>
+                    </pic:cNvPicPr>
+                  </pic:nvPicPr>
+                  <pic:blipFill>
+                    <a:blip r:embed="rId26"/>
+                    <a:srcRect l="12000" t="7000" r="12000" b="29000"/>
+                    <a:stretch>
+                      <a:fillRect/>
+                    </a:stretch>
+                  </pic:blipFill>
+                  <pic:spPr>
+                    <a:xfrm>
+                      <a:off x="0" y="0"/>
+                      <a:ext cx="5257800" cy="2764884"/>
+                    </a:xfrm>
+                    <a:prstGeom prst="rect">
+                      <a:avLst/>
+                    </a:prstGeom>
+                  </pic:spPr>
+                </pic:pic>
+              </a:graphicData>
+            </a:graphic>
+          </wp:inline>
+        </w:drawing>
+      </w:r>
+    </w:p>
+    <w:p>
+      <w:pPr>
+        <w:pStyle w:val="38"/>
+        <w:keepNext w:val="0"/>
+        <w:spacing w:line="240" w:lineRule="auto"/>
+        <w:jc w:val="center"/>
+      </w:pPr>
+      <w:r>
+        <w:rPr>
+          <w:rFonts w:ascii="Arial" w:hAnsi="Arial"/>
+          <w:sz w:val="18"/>
+        </w:rPr>
+        <w:t>Figure 15 GitHub main branch file listing</w:t>
+      </w:r>
+    </w:p>
+    <w:p>
+      <w:pPr>
+        <w:pStyle w:val="3"/>
+        <w:pageBreakBefore/>
+      </w:pPr>
+      <w:r>
+        <w:t>Default main and retained personal branch</w:t>
+      </w:r>
+    </w:p>
+    <w:p>
+      <w:pPr>
+        <w:pStyle w:val="38"/>
+      </w:pPr>
+      <w:r>
+        <w:t>The final branches page identifies main as Default and retains feature/wanghao-pos. The personal branch has zero commits ahead and three behind main in this view: its commits are included in main, and main contains later merge and cleanup work. The branch has not been deleted.</w:t>
+      </w:r>
+    </w:p>
+    <w:p>
+      <w:pPr>
+        <w:spacing w:after="100" w:line="240" w:lineRule="auto"/>
+        <w:jc w:val="center"/>
+      </w:pPr>
+      <w:r>
+        <w:drawing>
+          <wp:inline distT="0" distB="0" distL="114300" distR="114300">
+            <wp:extent cx="5257800" cy="2272665"/>
+            <wp:effectExtent l="0" t="0" r="0" b="635"/>
+            <wp:docPr id="483976754" name="Picture 483976754"/>
+            <wp:cNvGraphicFramePr>
+              <a:graphicFrameLocks xmlns:a="http://schemas.openxmlformats.org/drawingml/2006/main" noChangeAspect="1"/>
+            </wp:cNvGraphicFramePr>
+            <a:graphic xmlns:a="http://schemas.openxmlformats.org/drawingml/2006/main">
+              <a:graphicData uri="http://schemas.openxmlformats.org/drawingml/2006/picture">
+                <pic:pic xmlns:pic="http://schemas.openxmlformats.org/drawingml/2006/picture">
+                  <pic:nvPicPr>
+                    <pic:cNvPr id="483976754" name="Picture 483976754"/>
+                    <pic:cNvPicPr>
+                      <a:picLocks noChangeAspect="1"/>
+                    </pic:cNvPicPr>
+                  </pic:nvPicPr>
+                  <pic:blipFill>
+                    <a:blip r:embed="rId27"/>
+                    <a:srcRect l="11000" t="17000" r="11000" b="29000"/>
+                    <a:stretch>
+                      <a:fillRect/>
+                    </a:stretch>
+                  </pic:blipFill>
+                  <pic:spPr>
+                    <a:xfrm>
+                      <a:off x="0" y="0"/>
+                      <a:ext cx="5257800" cy="2273053"/>
+                    </a:xfrm>
+                    <a:prstGeom prst="rect">
+                      <a:avLst/>
+                    </a:prstGeom>
+                  </pic:spPr>
+                </pic:pic>
+              </a:graphicData>
+            </a:graphic>
+          </wp:inline>
+        </w:drawing>
+      </w:r>
+    </w:p>
+    <w:p>
+      <w:pPr>
+        <w:pStyle w:val="38"/>
+        <w:keepNext w:val="0"/>
+        <w:spacing w:line="240" w:lineRule="auto"/>
+        <w:jc w:val="center"/>
+      </w:pPr>
+      <w:r>
+        <w:rPr>
+          <w:rFonts w:ascii="Arial" w:hAnsi="Arial"/>
+          <w:sz w:val="18"/>
+        </w:rPr>
+        <w:t>Figure 16 Final default main branch and retained personal branch</w:t>
+      </w:r>
+    </w:p>
+    <w:p>
+      <w:pPr>
+        <w:pStyle w:val="3"/>
+        <w:pageBreakBefore/>
+      </w:pPr>
+      <w:r>
+        <w:t>Merged history and remote synchronization</w:t>
+      </w:r>
+    </w:p>
+    <w:p>
+      <w:pPr>
+        <w:pStyle w:val="38"/>
+      </w:pPr>
+      <w:r>
+        <w:t>The git log graph shows local main and origin/main both at 4749b88 after merging the remote personal branch cleanup. The implementation commit a1e573e and the initialization commit 9ecf584 remain in the graph. The remote personal branch is retained at 5a513c9.</w:t>
+      </w:r>
+    </w:p>
+    <w:p>
+      <w:pPr>
+        <w:pStyle w:val="38"/>
+      </w:pPr>
+      <w:r>
+        <w:t>The origin/HEAD label in this terminal capture still points to the earlier remote default because the screenshot predates the GitHub default-branch change. Figure 16 records the later GitHub setting. This local tracking label does not contradict main being the final server default.</w:t>
+      </w:r>
+    </w:p>
+    <w:p>
+      <w:pPr>
+        <w:spacing w:after="100" w:line="240" w:lineRule="auto"/>
+        <w:jc w:val="center"/>
+      </w:pPr>
+      <w:r>
+        <w:drawing>
+          <wp:inline distT="0" distB="0" distL="114300" distR="114300">
+            <wp:extent cx="5257800" cy="820420"/>
+            <wp:effectExtent l="0" t="0" r="0" b="5080"/>
+            <wp:docPr id="483976755" name="Picture 483976755"/>
+            <wp:cNvGraphicFramePr>
+              <a:graphicFrameLocks xmlns:a="http://schemas.openxmlformats.org/drawingml/2006/main" noChangeAspect="1"/>
+            </wp:cNvGraphicFramePr>
+            <a:graphic xmlns:a="http://schemas.openxmlformats.org/drawingml/2006/main">
+              <a:graphicData uri="http://schemas.openxmlformats.org/drawingml/2006/picture">
+                <pic:pic xmlns:pic="http://schemas.openxmlformats.org/drawingml/2006/picture">
+                  <pic:nvPicPr>
+                    <pic:cNvPr id="483976755" name="Picture 483976755"/>
+                    <pic:cNvPicPr>
+                      <a:picLocks noChangeAspect="1"/>
+                    </pic:cNvPicPr>
+                  </pic:nvPicPr>
+                  <pic:blipFill>
+                    <a:blip r:embed="rId28"/>
+                    <a:srcRect t="2500" b="72500"/>
+                    <a:stretch>
+                      <a:fillRect/>
+                    </a:stretch>
+                  </pic:blipFill>
+                  <pic:spPr>
+                    <a:xfrm>
+                      <a:off x="0" y="0"/>
+                      <a:ext cx="5257800" cy="820824"/>
+                    </a:xfrm>
+                    <a:prstGeom prst="rect">
+                      <a:avLst/>
+                    </a:prstGeom>
+                  </pic:spPr>
+                </pic:pic>
+              </a:graphicData>
+            </a:graphic>
+          </wp:inline>
+        </w:drawing>
+      </w:r>
+    </w:p>
+    <w:p>
+      <w:pPr>
+        <w:pStyle w:val="38"/>
+        <w:keepNext w:val="0"/>
+        <w:spacing w:line="240" w:lineRule="auto"/>
+        <w:jc w:val="center"/>
+      </w:pPr>
+      <w:r>
+        <w:rPr>
+          <w:rFonts w:ascii="Arial" w:hAnsi="Arial"/>
+          <w:sz w:val="18"/>
+        </w:rPr>
+        <w:t>Figure 17 Actual merged Git history and synchronized main</w:t>
+      </w:r>
+    </w:p>
+    <w:p>
+      <w:pPr>
+        <w:pStyle w:val="3"/>
+        <w:pageBreakBefore/>
+      </w:pPr>
+      <w:r>
+        <w:t>Remote workflow and recorded presentation</w:t>
+      </w:r>
+    </w:p>
+    <w:p>
+      <w:pPr>
+        <w:pStyle w:val="38"/>
+      </w:pPr>
+      <w:r>
+        <w:t>The recorded workflow used git push -u origin main and git push -u origin feature/wanghao-pos. The first main push failed authentication. After browser authentication succeeded during the personal-branch push, retrying the main push succeeded. The original PowerShell transcript is preserved as GIT_COMMAND_HISTORY.txt.</w:t>
+      </w:r>
+    </w:p>
+    <w:p>
+      <w:pPr>
+        <w:pStyle w:val="38"/>
+      </w:pPr>
+      <w:r>
+        <w:t>The later verification used git fetch origin followed by git --no-pager log --all --graph --decorate --oneline -15. Remote cleanup commits were integrated using git merge --no-ff origin/feature/wanghao-pos -m "Merge preparation-file cleanup from personal branch", then git push origin main. Figure 17 shows the resulting main and origin/main agreement.</w:t>
+      </w:r>
+    </w:p>
+    <w:p>
+      <w:pPr>
+        <w:pStyle w:val="38"/>
+      </w:pPr>
+      <w:r>
+        <w:t>The transcript does not capture every native Git output line. The missing text has not been reconstructed inside the transcript. The repository screenshots, successful push output and commit graph supply complementary evidence of the remote state.</w:t>
+      </w:r>
+    </w:p>
+    <w:p>
+      <w:pPr>
+        <w:pStyle w:val="38"/>
+      </w:pPr>
+      <w:r>
+        <w:t xml:space="preserve">The repository screenshots identify the captured code revision before the report evidence was added. The presentation has been recorded and uploaded to bilibili. Recorded presentation: </w:t>
+      </w:r>
+      <w:r>
+        <w:fldChar w:fldCharType="begin"/>
+      </w:r>
+      <w:r>
+        <w:instrText xml:space="preserve"> HYPERLINK "https://www.bilibili.com/video/BV1xgnp64E3X/" \h </w:instrText>
+      </w:r>
+      <w:r>
+        <w:fldChar w:fldCharType="separate"/>
+      </w:r>
+      <w:r>
+        <w:rPr>
+          <w:rFonts w:ascii="Arial" w:hAnsi="Arial"/>
+          <w:sz w:val="21"/>
+        </w:rPr>
+        <w:t>https://www.bilibili.com/video/BV1xgnp64E3X/</w:t>
+      </w:r>
+      <w:r>
+        <w:rPr>
+          <w:rFonts w:ascii="Arial" w:hAnsi="Arial"/>
+          <w:sz w:val="21"/>
+        </w:rPr>
+        <w:fldChar w:fldCharType="end"/>
+      </w:r>
+      <w:r>
+        <w:t>. The video presents the slides and the POS demonstration; its URL is also included on the cover.</w:t>
+      </w:r>
+    </w:p>
+    <w:p>
+      <w:pPr>
+        <w:pStyle w:val="38"/>
+      </w:pPr>
+      <w:r>
+        <w:t>The project is an individual submission. The agile section provides the proposed sprint plan and ideal burndown. No historical daily measurements or group activities are claimed.</w:t>
       </w:r>
     </w:p>
     <w:p>
@@ -6416,7 +6338,7 @@
         <w:pStyle w:val="2"/>
         <w:pageBreakBefore/>
       </w:pPr>
-      <w:bookmarkStart w:id="20" w:name="_Toc3551"/>
+      <w:bookmarkStart w:id="20" w:name="_Toc32671"/>
       <w:r>
         <w:t>21 References</w:t>
       </w:r>
@@ -6738,7 +6660,7 @@
     <w:lsdException w:uiPriority="99" w:name="HTML Sample"/>
     <w:lsdException w:uiPriority="99" w:name="HTML Typewriter"/>
     <w:lsdException w:uiPriority="99" w:name="HTML Variable"/>
-    <w:lsdException w:uiPriority="99" w:name="Normal Table"/>
+    <w:lsdException w:qFormat="1" w:uiPriority="99" w:name="Normal Table"/>
     <w:lsdException w:uiPriority="99" w:name="annotation subject"/>
     <w:lsdException w:uiPriority="99" w:name="Table Simple 1"/>
     <w:lsdException w:uiPriority="99" w:name="Table Simple 2"/>
@@ -7139,6 +7061,7 @@
     <w:name w:val="Normal Table"/>
     <w:semiHidden/>
     <w:unhideWhenUsed/>
+    <w:qFormat/>
     <w:uiPriority w:val="99"/>
     <w:tblPr>
       <w:tblCellMar>
@@ -7264,6 +7187,7 @@
     <w:basedOn w:val="17"/>
     <w:link w:val="3"/>
     <w:semiHidden/>
+    <w:qFormat/>
     <w:uiPriority w:val="9"/>
     <w:rPr>
       <w:rFonts w:asciiTheme="majorHAnsi" w:hAnsiTheme="majorHAnsi" w:eastAsiaTheme="majorEastAsia" w:cstheme="majorBidi"/>

</xml_diff>